<commit_message>
Audit four additional Daxu entries and flag textual discrepancy
</commit_message>
<xml_diff>
--- a/youwen/manuscript/yisheng_paper_v6.docx
+++ b/youwen/manuscript/yisheng_paper_v6.docx
@@ -6026,7 +6026,34 @@
         <w:t xml:space="preserve"> </w:t>
       </w:r>
       <w:r>
-        <w:t xml:space="preserve">were identified by a heuristic. The selected Dà Xú passages listed in the source-check ledger were checked against the scanned Chen Changzhi edition, but a character-by-character collation of all 212 population entries against the print remains to be done. Ten labels stay outside the Xiǎo Xú comparison: nine stand in text that the Xiǎo Xú took from the Dà Xú (the seven of juan 25 and, probably, </w:t>
+        <w:t xml:space="preserve">were identified by a heuristic. The selected Dà Xú passages listed in the source-check ledger were checked against the scanned Chen Changzhi edition, but a character-by-character collation of all 212 population entries against the print remains to be done. One digital entry, </w:t>
+      </w:r>
+      <w:r>
+        <w:rPr>
+          <w:rFonts w:hint="eastAsia"/>
+        </w:rPr>
+        <w:t xml:space="preserve">𨻺</w:t>
+      </w:r>
+      <w:r>
+        <w:t xml:space="preserve"> (U+28EFA), was not found between </w:t>
+      </w:r>
+      <w:r>
+        <w:rPr>
+          <w:rFonts w:hint="eastAsia"/>
+        </w:rPr>
+        <w:t xml:space="preserve">隓</w:t>
+      </w:r>
+      <w:r>
+        <w:t xml:space="preserve"> and </w:t>
+      </w:r>
+      <w:r>
+        <w:rPr>
+          <w:rFonts w:hint="eastAsia"/>
+        </w:rPr>
+        <w:t xml:space="preserve">陊</w:t>
+      </w:r>
+      <w:r>
+        <w:t xml:space="preserve"> at its expected place in that scan; another print is needed to resolve the discrepancy. Ten labels stay outside the Xiǎo Xú comparison: nine stand in text that the Xiǎo Xú took from the Dà Xú (the seven of juan 25 and, probably, </w:t>
       </w:r>
       <w:r>
         <w:rPr>

</xml_diff>

<commit_message>
Finalize v6 with documented Daxu spot check
</commit_message>
<xml_diff>
--- a/youwen/manuscript/yisheng_paper_v6.docx
+++ b/youwen/manuscript/yisheng_paper_v6.docx
@@ -2148,7 +2148,23 @@
         <w:t xml:space="preserve"> </w:t>
       </w:r>
       <w:r>
-        <w:t xml:space="preserve">of the shuowenjiezi project (GitHub, Apache-2.0): 9,833 head entries with the Dà Xú fǎnqiè and Duan’s commentary. We checked the Dà Xú glosses and structural formulas quoted in the key examples character by character against a scan of Chen Changzhi’s 1873 edition in the Waseda University Library; the checked passages and scan locations are recorded in the source-check ledger. The 1963 Zhonghua edition reproduces this edition at reduced size; our direct check was of the Waseda scan, not a physical copy of the Zhonghua printing. A pattern search finds the</w:t>
+        <w:t xml:space="preserve">of the shuowenjiezi project (GitHub, Apache-2.0): 9,833 head entries with the Dà Xú fǎnqiè and Duan’s commentary. We visually checked the headword, relevant gloss and</w:t>
+      </w:r>
+      <w:r>
+        <w:t xml:space="preserve"> </w:t>
+      </w:r>
+      <w:r>
+        <w:rPr>
+          <w:i/>
+          <w:iCs/>
+        </w:rPr>
+        <w:t xml:space="preserve">yìshēng</w:t>
+      </w:r>
+      <w:r>
+        <w:t xml:space="preserve"> </w:t>
+      </w:r>
+      <w:r>
+        <w:t xml:space="preserve">formula for 104 selected entries from the 212-entry analysis set against a scan of Chen Changzhi’s 1873 edition in the Waseda University Library; we also checked the Dà Xú passages quoted in key examples. This was a targeted spot check, not a random sample or a complete collation. The checked entries and scan locations are recorded in the spot-check register and source-check ledger. The 1963 Zhonghua edition reproduces this edition at reduced size; our direct check was of the Waseda scan, not a physical copy of the Zhonghua printing. A pattern search finds the</w:t>
       </w:r>
       <w:r>
         <w:t xml:space="preserve"> </w:t>
@@ -6026,7 +6042,34 @@
         <w:t xml:space="preserve"> </w:t>
       </w:r>
       <w:r>
-        <w:t xml:space="preserve">were identified by a heuristic. The selected Dà Xú passages listed in the source-check ledger were checked against the scanned Chen Changzhi edition, but a character-by-character collation of all 212 population entries against the print remains to be done. One digital entry, </w:t>
+        <w:t xml:space="preserve">were identified by a heuristic. The targeted spot check covered 104 of the 212 analysed entries, plus passages quoted in the examples; the remaining entries were not collated character by character against the print. For 䢈, the digital text reads </w:t>
+      </w:r>
+      <w:r>
+        <w:rPr>
+          <w:rFonts w:hint="eastAsia"/>
+        </w:rPr>
+        <w:t xml:space="preserve">日月合宿从辰,</w:t>
+      </w:r>
+      <w:r>
+        <w:t xml:space="preserve"> whereas the checked Chen scan reads </w:t>
+      </w:r>
+      <w:r>
+        <w:rPr>
+          <w:rFonts w:hint="eastAsia"/>
+        </w:rPr>
+        <w:t xml:space="preserve">日月合宿爲辰;</w:t>
+      </w:r>
+      <w:r>
+        <w:t xml:space="preserve"> the subsequent </w:t>
+      </w:r>
+      <w:r>
+        <w:rPr>
+          <w:rFonts w:hint="eastAsia"/>
+        </w:rPr>
+        <w:t xml:space="preserve">辰亦聲</w:t>
+      </w:r>
+      <w:r>
+        <w:t xml:space="preserve"> formula agrees. One other digital entry, </w:t>
       </w:r>
       <w:r>
         <w:rPr>
@@ -6251,7 +6294,7 @@
         <w:t xml:space="preserve">project/youwen/</w:t>
       </w:r>
       <w:r>
-        <w:t xml:space="preserve">. The source-check ledger and coding provenance note are in</w:t>
+        <w:t xml:space="preserve">. The Dà Xú spot-check register, source-check ledger and coding provenance note are in</w:t>
       </w:r>
       <w:r>
         <w:t xml:space="preserve"> </w:t>

</xml_diff>

<commit_message>
Use Unicode codepoints for rare graphs in v6 Word rendering
</commit_message>
<xml_diff>
--- a/youwen/manuscript/yisheng_paper_v6.docx
+++ b/youwen/manuscript/yisheng_paper_v6.docx
@@ -1527,16 +1527,7 @@
         <w:t xml:space="preserve"> </w:t>
       </w:r>
       <w:r>
-        <w:t xml:space="preserve">and </w:t>
-      </w:r>
-      <w:r>
-        <w:rPr>
-          <w:rFonts w:hint="eastAsia"/>
-        </w:rPr>
-        <w:t xml:space="preserve">𨻺</w:t>
-      </w:r>
-      <w:r>
-        <w:t xml:space="preserve"> (U+28EFA), both </w:t>
+        <w:t xml:space="preserve">and the graph U+28EFA, both </w:t>
       </w:r>
       <w:r>
         <w:rPr>
@@ -2189,16 +2180,7 @@
         <w:t xml:space="preserve">(從,</w:t>
       </w:r>
       <w:r>
-        <w:t xml:space="preserve"> </w:t>
-      </w:r>
-      <w:r>
-        <w:rPr>
-          <w:rFonts w:hint="eastAsia"/>
-        </w:rPr>
-        <w:t xml:space="preserve">𠔁</w:t>
-      </w:r>
-      <w:r>
-        <w:t xml:space="preserve"> [U+20501], </w:t>
+        <w:t xml:space="preserve"> U+20501, </w:t>
       </w:r>
       <w:r>
         <w:rPr>
@@ -5793,16 +5775,7 @@
         <w:t xml:space="preserve">傾,</w:t>
       </w:r>
       <w:r>
-        <w:t xml:space="preserve"> </w:t>
-      </w:r>
-      <w:r>
-        <w:rPr>
-          <w:rFonts w:hint="eastAsia"/>
-        </w:rPr>
-        <w:t xml:space="preserve">𨻺</w:t>
-      </w:r>
-      <w:r>
-        <w:t xml:space="preserve"> (U+28EFA) and 䫇 keep labels that his rule would withhold.</w:t>
+        <w:t xml:space="preserve"> the graph U+28EFA and 䫇 keep labels that his rule would withhold.</w:t>
       </w:r>
     </w:p>
     <w:p>
@@ -6042,7 +6015,7 @@
         <w:t xml:space="preserve"> </w:t>
       </w:r>
       <w:r>
-        <w:t xml:space="preserve">were identified by a heuristic. The targeted spot check covered 104 of the 212 analysed entries, plus passages quoted in the examples; the remaining entries were not collated character by character against the print. For 䢈, the digital text reads </w:t>
+        <w:t xml:space="preserve">were identified by a heuristic. The targeted spot check covered 104 of the 212 analysed entries, plus passages quoted in the examples; the remaining entries were not collated character by character against the print. For the graph U+4888, the digital text reads </w:t>
       </w:r>
       <w:r>
         <w:rPr>
@@ -6069,16 +6042,7 @@
         <w:t xml:space="preserve">辰亦聲</w:t>
       </w:r>
       <w:r>
-        <w:t xml:space="preserve"> formula agrees. One other digital entry, </w:t>
-      </w:r>
-      <w:r>
-        <w:rPr>
-          <w:rFonts w:hint="eastAsia"/>
-        </w:rPr>
-        <w:t xml:space="preserve">𨻺</w:t>
-      </w:r>
-      <w:r>
-        <w:t xml:space="preserve"> (U+28EFA), was not found between </w:t>
+        <w:t xml:space="preserve"> formula agrees. One other digital entry, U+28EFA, was not found between </w:t>
       </w:r>
       <w:r>
         <w:rPr>

</xml_diff>